<commit_message>
Luria: show and dictate same ten words on editable specialist sheets
</commit_message>
<xml_diff>
--- a/downloads/luria_10_words_guide_with_protocol.docx
+++ b/downloads/luria_10_words_guide_with_protocol.docx
@@ -74,7 +74,7 @@
           <w:rFonts w:ascii="Arial" w:hAnsi="Arial"/>
           <w:sz w:val="19"/>
         </w:rPr>
-        <w:t xml:space="preserve">Тихое помещение, отдельный десятисловный стимульный список только для специалиста, регистрационный лист без предъявляемых слов и ответов.</w:t>
+        <w:t xml:space="preserve">Тихое помещение, рабочий регистрационный лист специалиста с десятью словами в верхней строке таблицы. Читать слова слева направо. Участник не видит лист.</w:t>
       </w:r>
     </w:p>
     <w:p>
@@ -124,7 +124,7 @@
           <w:rFonts w:ascii="Arial" w:hAnsi="Arial"/>
           <w:sz w:val="19"/>
         </w:rPr>
-        <w:t xml:space="preserve">1. Прочитать 10 слов из отдельного списка с интервалами 1-2 секунды.</w:t>
+        <w:t xml:space="preserve">1. Прочитать 10 слов по верхней строке регистрационного листа слева направо с интервалами 1-2 секунды.</w:t>
       </w:r>
     </w:p>
     <w:p>
@@ -383,7 +383,7 @@
                 <w:sz w:val="16"/>
                 <w:b/>
               </w:rPr>
-              <w:t xml:space="preserve">1</w:t>
+              <w:t xml:space="preserve">лес</w:t>
             </w:r>
           </w:p>
         </w:tc>
@@ -403,7 +403,7 @@
                 <w:sz w:val="16"/>
                 <w:b/>
               </w:rPr>
-              <w:t xml:space="preserve">2</w:t>
+              <w:t xml:space="preserve">хлеб</w:t>
             </w:r>
           </w:p>
         </w:tc>
@@ -423,7 +423,7 @@
                 <w:sz w:val="16"/>
                 <w:b/>
               </w:rPr>
-              <w:t xml:space="preserve">3</w:t>
+              <w:t xml:space="preserve">окно</w:t>
             </w:r>
           </w:p>
         </w:tc>
@@ -443,7 +443,7 @@
                 <w:sz w:val="16"/>
                 <w:b/>
               </w:rPr>
-              <w:t xml:space="preserve">4</w:t>
+              <w:t xml:space="preserve">стул</w:t>
             </w:r>
           </w:p>
         </w:tc>
@@ -463,7 +463,7 @@
                 <w:sz w:val="16"/>
                 <w:b/>
               </w:rPr>
-              <w:t xml:space="preserve">5</w:t>
+              <w:t xml:space="preserve">вода</w:t>
             </w:r>
           </w:p>
         </w:tc>
@@ -483,7 +483,7 @@
                 <w:sz w:val="16"/>
                 <w:b/>
               </w:rPr>
-              <w:t xml:space="preserve">6</w:t>
+              <w:t xml:space="preserve">брат</w:t>
             </w:r>
           </w:p>
         </w:tc>
@@ -503,7 +503,7 @@
                 <w:sz w:val="16"/>
                 <w:b/>
               </w:rPr>
-              <w:t xml:space="preserve">7</w:t>
+              <w:t xml:space="preserve">конь</w:t>
             </w:r>
           </w:p>
         </w:tc>
@@ -523,7 +523,7 @@
                 <w:sz w:val="16"/>
                 <w:b/>
               </w:rPr>
-              <w:t xml:space="preserve">8</w:t>
+              <w:t xml:space="preserve">гриб</w:t>
             </w:r>
           </w:p>
         </w:tc>
@@ -543,7 +543,7 @@
                 <w:sz w:val="16"/>
                 <w:b/>
               </w:rPr>
-              <w:t xml:space="preserve">9</w:t>
+              <w:t xml:space="preserve">игла</w:t>
             </w:r>
           </w:p>
         </w:tc>
@@ -563,7 +563,7 @@
                 <w:sz w:val="16"/>
                 <w:b/>
               </w:rPr>
-              <w:t xml:space="preserve">10</w:t>
+              <w:t xml:space="preserve">мед</w:t>
             </w:r>
           </w:p>
         </w:tc>
@@ -1462,7 +1462,7 @@
           <w:rFonts w:ascii="Arial" w:hAnsi="Arial"/>
           <w:sz w:val="18"/>
         </w:rPr>
-        <w:t xml:space="preserve">Колонки 1-10 соответствуют номерам слов отдельного списка специалиста. Заносить ответы и отмечать проведенность проб вручную.</w:t>
+        <w:t xml:space="preserve">Слова специалист читает из верхней строки таблицы слева направо. Лист не показывают ребенку. Заносить ответы и отмечать проведенность проб вручную.</w:t>
       </w:r>
     </w:p>
     <w:p>

</xml_diff>